<commit_message>
Starten på anden uge i Juli. 2 uger til at jeg vil have bacheloren færdig
</commit_message>
<xml_diff>
--- a/7. Semester/Bachelor afslutningsplan.docx
+++ b/7. Semester/Bachelor afslutningsplan.docx
@@ -1787,8 +1787,985 @@
         <w:rPr>
           <w:rFonts w:eastAsiaTheme="minorEastAsia"/>
         </w:rPr>
-        <w:t xml:space="preserve">Med den ekstra tid i programmet, så løsner det også for byrden. Der er tid til tilbageslag eller andre uvedkommende ting. </w:t>
-      </w:r>
+        <w:t>Med den ekstra tid i programmet, så løsner det også for byrden. Der er tid til tilbageslag eller andre uvedkommende ting.</w:t>
+      </w:r>
+    </w:p>
+    <w:p>
+      <w:pPr>
+        <w:rPr>
+          <w:rFonts w:eastAsiaTheme="minorEastAsia"/>
+        </w:rPr>
+      </w:pPr>
+    </w:p>
+    <w:p>
+      <w:pPr>
+        <w:pStyle w:val="Overskrift1"/>
+        <w:rPr>
+          <w:rFonts w:eastAsiaTheme="minorEastAsia"/>
+        </w:rPr>
+      </w:pPr>
+      <w:r>
+        <w:rPr>
+          <w:rFonts w:eastAsiaTheme="minorEastAsia"/>
+        </w:rPr>
+        <w:lastRenderedPageBreak/>
+        <w:t>Opdateret plan</w:t>
+      </w:r>
+    </w:p>
+    <w:p>
+      <w:pPr>
+        <w:pStyle w:val="Overskrift2"/>
+      </w:pPr>
+      <w:r>
+        <w:t xml:space="preserve">Hvad? </w:t>
+      </w:r>
+    </w:p>
+    <w:p>
+      <w:r>
+        <w:t xml:space="preserve">Fordi jeg har klaret Statistical Learning and Machine Learning med bravur. 7 i Mikrobølgeelektronik og Design og 10 i Statistical Learning and Machine Learning. Nu har jeg afviklingen af mit bachelorprojekt tilbage. </w:t>
+      </w:r>
+    </w:p>
+    <w:p>
+      <w:pPr>
+        <w:rPr>
+          <w:rFonts w:eastAsiaTheme="minorEastAsia"/>
+        </w:rPr>
+      </w:pPr>
+    </w:p>
+    <w:p>
+      <w:pPr>
+        <w:pStyle w:val="Overskrift2"/>
+        <w:rPr>
+          <w:rFonts w:eastAsiaTheme="minorEastAsia"/>
+        </w:rPr>
+      </w:pPr>
+      <w:r>
+        <w:rPr>
+          <w:rFonts w:eastAsiaTheme="minorEastAsia"/>
+        </w:rPr>
+        <w:t xml:space="preserve">Hvor meget? </w:t>
+      </w:r>
+    </w:p>
+    <w:p>
+      <w:r>
+        <w:t xml:space="preserve">Jeg mangler at få beskrevet PCA med THz generering og modtagelse, noget omkring sort </w:t>
+      </w:r>
+      <w:proofErr w:type="spellStart"/>
+      <w:r>
+        <w:t>sillicium</w:t>
+      </w:r>
+      <w:proofErr w:type="spellEnd"/>
+      <w:r>
+        <w:t xml:space="preserve">, få set på min databehandling og få det skrevet ned. Have styr på </w:t>
+      </w:r>
+      <w:proofErr w:type="spellStart"/>
+      <w:r>
+        <w:t>formalierne</w:t>
+      </w:r>
+      <w:proofErr w:type="spellEnd"/>
+      <w:r>
+        <w:t xml:space="preserve">. </w:t>
+      </w:r>
+    </w:p>
+    <w:p>
+      <w:pPr>
+        <w:rPr>
+          <w:rFonts w:eastAsiaTheme="minorEastAsia"/>
+        </w:rPr>
+      </w:pPr>
+    </w:p>
+    <w:p>
+      <w:pPr>
+        <w:pStyle w:val="Overskrift2"/>
+        <w:rPr>
+          <w:rFonts w:eastAsiaTheme="minorEastAsia"/>
+        </w:rPr>
+      </w:pPr>
+      <w:r>
+        <w:rPr>
+          <w:rFonts w:eastAsiaTheme="minorEastAsia"/>
+        </w:rPr>
+        <w:t xml:space="preserve">Hvordan? </w:t>
+      </w:r>
+    </w:p>
+    <w:p>
+      <w:r>
+        <w:t xml:space="preserve">Jeg ønsker, at jeg den 31. </w:t>
+      </w:r>
+      <w:proofErr w:type="gramStart"/>
+      <w:r>
+        <w:t>Juni</w:t>
+      </w:r>
+      <w:proofErr w:type="gramEnd"/>
+      <w:r>
+        <w:t xml:space="preserve"> har et udkast klar, som jeg kan sende til Pernille og Rasmus. I dag er mandag den 15. </w:t>
+      </w:r>
+      <w:proofErr w:type="gramStart"/>
+      <w:r>
+        <w:t>Juni</w:t>
+      </w:r>
+      <w:proofErr w:type="gramEnd"/>
+      <w:r>
+        <w:t>, så jeg har 9 hverdage tilbage efter i dag, plus nogle weekend dage måske, men måske fratrukket nogle fejringsdage med de andre.</w:t>
+      </w:r>
+    </w:p>
+    <w:p>
+      <w:pPr>
+        <w:rPr>
+          <w:rFonts w:eastAsiaTheme="minorEastAsia"/>
+        </w:rPr>
+      </w:pPr>
+      <w:r>
+        <w:t xml:space="preserve">Lad mig sige, at jeg har 10 dages arbejde tilbage efter i dag. Hvis jeg vil lægge 4 timer i det per dag, så har jeg at </w:t>
+      </w:r>
+      <w:r>
+        <w:br/>
+      </w:r>
+      <m:oMath>
+        <m:r>
+          <w:rPr>
+            <w:rFonts w:ascii="Cambria Math" w:hAnsi="Cambria Math"/>
+          </w:rPr>
+          <m:t>10·4timer=40timer</m:t>
+        </m:r>
+        <m:r>
+          <w:rPr>
+            <w:rFonts w:ascii="Cambria Math" w:eastAsiaTheme="minorEastAsia" w:hAnsi="Cambria Math"/>
+          </w:rPr>
+          <m:t>'s</m:t>
+        </m:r>
+      </m:oMath>
+      <w:r>
+        <w:rPr>
+          <w:rFonts w:eastAsiaTheme="minorEastAsia"/>
+        </w:rPr>
+        <w:t xml:space="preserve"> </w:t>
+      </w:r>
+      <w:r>
+        <w:rPr>
+          <w:rFonts w:eastAsiaTheme="minorEastAsia"/>
+        </w:rPr>
+        <w:br/>
+        <w:t xml:space="preserve">Arbejde til rådighed. </w:t>
+      </w:r>
+    </w:p>
+    <w:p>
+      <w:pPr>
+        <w:rPr>
+          <w:rFonts w:eastAsiaTheme="minorEastAsia"/>
+        </w:rPr>
+      </w:pPr>
+      <w:r>
+        <w:rPr>
+          <w:rFonts w:eastAsiaTheme="minorEastAsia"/>
+        </w:rPr>
+        <w:t xml:space="preserve">Det er alligevel en god mængde timer, hvis jeg kan få dem brugt effektivt. Min fordeling vil være. </w:t>
+      </w:r>
+    </w:p>
+    <w:tbl>
+      <w:tblPr>
+        <w:tblStyle w:val="Tabel-Gitter"/>
+        <w:tblW w:w="0" w:type="auto"/>
+        <w:tblLook w:val="04A0" w:firstRow="1" w:lastRow="0" w:firstColumn="1" w:lastColumn="0" w:noHBand="0" w:noVBand="1"/>
+      </w:tblPr>
+      <w:tblGrid>
+        <w:gridCol w:w="1375"/>
+        <w:gridCol w:w="1375"/>
+        <w:gridCol w:w="1375"/>
+        <w:gridCol w:w="1375"/>
+        <w:gridCol w:w="1376"/>
+        <w:gridCol w:w="1376"/>
+        <w:gridCol w:w="1376"/>
+      </w:tblGrid>
+      <w:tr>
+        <w:tc>
+          <w:tcPr>
+            <w:tcW w:w="1375" w:type="dxa"/>
+          </w:tcPr>
+          <w:p>
+            <w:pPr>
+              <w:rPr>
+                <w:rFonts w:eastAsiaTheme="minorEastAsia"/>
+              </w:rPr>
+            </w:pPr>
+            <w:r>
+              <w:rPr>
+                <w:rFonts w:eastAsiaTheme="minorEastAsia"/>
+              </w:rPr>
+              <w:t>Man 15/6</w:t>
+            </w:r>
+          </w:p>
+          <w:p>
+            <w:pPr>
+              <w:jc w:val="center"/>
+              <w:rPr>
+                <w:rFonts w:eastAsiaTheme="minorEastAsia"/>
+              </w:rPr>
+            </w:pPr>
+          </w:p>
+        </w:tc>
+        <w:tc>
+          <w:tcPr>
+            <w:tcW w:w="1375" w:type="dxa"/>
+          </w:tcPr>
+          <w:p>
+            <w:pPr>
+              <w:rPr>
+                <w:rFonts w:eastAsiaTheme="minorEastAsia"/>
+              </w:rPr>
+            </w:pPr>
+            <w:proofErr w:type="spellStart"/>
+            <w:r>
+              <w:rPr>
+                <w:rFonts w:eastAsiaTheme="minorEastAsia"/>
+              </w:rPr>
+              <w:t>Tirs</w:t>
+            </w:r>
+            <w:proofErr w:type="spellEnd"/>
+            <w:r>
+              <w:rPr>
+                <w:rFonts w:eastAsiaTheme="minorEastAsia"/>
+              </w:rPr>
+              <w:t xml:space="preserve"> 16/6</w:t>
+            </w:r>
+          </w:p>
+          <w:p>
+            <w:pPr>
+              <w:jc w:val="center"/>
+              <w:rPr>
+                <w:rFonts w:eastAsiaTheme="minorEastAsia"/>
+              </w:rPr>
+            </w:pPr>
+            <w:r>
+              <w:rPr>
+                <w:rFonts w:eastAsiaTheme="minorEastAsia"/>
+              </w:rPr>
+              <w:t>4 timer</w:t>
+            </w:r>
+          </w:p>
+        </w:tc>
+        <w:tc>
+          <w:tcPr>
+            <w:tcW w:w="1375" w:type="dxa"/>
+          </w:tcPr>
+          <w:p>
+            <w:pPr>
+              <w:rPr>
+                <w:rFonts w:eastAsiaTheme="minorEastAsia"/>
+              </w:rPr>
+            </w:pPr>
+            <w:r>
+              <w:rPr>
+                <w:rFonts w:eastAsiaTheme="minorEastAsia"/>
+              </w:rPr>
+              <w:t>Ons 17/6</w:t>
+            </w:r>
+          </w:p>
+          <w:p>
+            <w:pPr>
+              <w:jc w:val="center"/>
+              <w:rPr>
+                <w:rFonts w:eastAsiaTheme="minorEastAsia"/>
+              </w:rPr>
+            </w:pPr>
+            <w:r>
+              <w:rPr>
+                <w:rFonts w:eastAsiaTheme="minorEastAsia"/>
+              </w:rPr>
+              <w:t>4 timer</w:t>
+            </w:r>
+          </w:p>
+        </w:tc>
+        <w:tc>
+          <w:tcPr>
+            <w:tcW w:w="1375" w:type="dxa"/>
+          </w:tcPr>
+          <w:p>
+            <w:pPr>
+              <w:rPr>
+                <w:rFonts w:eastAsiaTheme="minorEastAsia"/>
+              </w:rPr>
+            </w:pPr>
+            <w:r>
+              <w:rPr>
+                <w:rFonts w:eastAsiaTheme="minorEastAsia"/>
+              </w:rPr>
+              <w:t xml:space="preserve">Tors 18/6 </w:t>
+            </w:r>
+          </w:p>
+          <w:p>
+            <w:pPr>
+              <w:jc w:val="center"/>
+              <w:rPr>
+                <w:rFonts w:eastAsiaTheme="minorEastAsia"/>
+              </w:rPr>
+            </w:pPr>
+            <w:r>
+              <w:rPr>
+                <w:rFonts w:eastAsiaTheme="minorEastAsia"/>
+              </w:rPr>
+              <w:t>4 timer</w:t>
+            </w:r>
+          </w:p>
+        </w:tc>
+        <w:tc>
+          <w:tcPr>
+            <w:tcW w:w="1376" w:type="dxa"/>
+          </w:tcPr>
+          <w:p>
+            <w:pPr>
+              <w:rPr>
+                <w:rFonts w:eastAsiaTheme="minorEastAsia"/>
+              </w:rPr>
+            </w:pPr>
+            <w:proofErr w:type="spellStart"/>
+            <w:r>
+              <w:rPr>
+                <w:rFonts w:eastAsiaTheme="minorEastAsia"/>
+              </w:rPr>
+              <w:t>Fre</w:t>
+            </w:r>
+            <w:proofErr w:type="spellEnd"/>
+            <w:r>
+              <w:rPr>
+                <w:rFonts w:eastAsiaTheme="minorEastAsia"/>
+              </w:rPr>
+              <w:t xml:space="preserve"> 19/6</w:t>
+            </w:r>
+          </w:p>
+          <w:p>
+            <w:pPr>
+              <w:jc w:val="center"/>
+              <w:rPr>
+                <w:rFonts w:eastAsiaTheme="minorEastAsia"/>
+              </w:rPr>
+            </w:pPr>
+            <w:r>
+              <w:rPr>
+                <w:rFonts w:eastAsiaTheme="minorEastAsia"/>
+              </w:rPr>
+              <w:t>4 timer</w:t>
+            </w:r>
+          </w:p>
+        </w:tc>
+        <w:tc>
+          <w:tcPr>
+            <w:tcW w:w="1376" w:type="dxa"/>
+          </w:tcPr>
+          <w:p>
+            <w:pPr>
+              <w:rPr>
+                <w:rFonts w:eastAsiaTheme="minorEastAsia"/>
+              </w:rPr>
+            </w:pPr>
+            <w:proofErr w:type="spellStart"/>
+            <w:r>
+              <w:rPr>
+                <w:rFonts w:eastAsiaTheme="minorEastAsia"/>
+              </w:rPr>
+              <w:t>Lør</w:t>
+            </w:r>
+            <w:proofErr w:type="spellEnd"/>
+            <w:r>
+              <w:rPr>
+                <w:rFonts w:eastAsiaTheme="minorEastAsia"/>
+              </w:rPr>
+              <w:t xml:space="preserve"> 20/6</w:t>
+            </w:r>
+          </w:p>
+          <w:p>
+            <w:pPr>
+              <w:jc w:val="center"/>
+              <w:rPr>
+                <w:rFonts w:eastAsiaTheme="minorEastAsia"/>
+              </w:rPr>
+            </w:pPr>
+          </w:p>
+        </w:tc>
+        <w:tc>
+          <w:tcPr>
+            <w:tcW w:w="1376" w:type="dxa"/>
+          </w:tcPr>
+          <w:p>
+            <w:pPr>
+              <w:rPr>
+                <w:rFonts w:eastAsiaTheme="minorEastAsia"/>
+              </w:rPr>
+            </w:pPr>
+            <w:r>
+              <w:rPr>
+                <w:rFonts w:eastAsiaTheme="minorEastAsia"/>
+              </w:rPr>
+              <w:t>Søn 21/6</w:t>
+            </w:r>
+          </w:p>
+          <w:p>
+            <w:pPr>
+              <w:jc w:val="center"/>
+              <w:rPr>
+                <w:rFonts w:eastAsiaTheme="minorEastAsia"/>
+              </w:rPr>
+            </w:pPr>
+          </w:p>
+        </w:tc>
+      </w:tr>
+      <w:tr>
+        <w:tc>
+          <w:tcPr>
+            <w:tcW w:w="1375" w:type="dxa"/>
+          </w:tcPr>
+          <w:p>
+            <w:pPr>
+              <w:rPr>
+                <w:rFonts w:eastAsiaTheme="minorEastAsia"/>
+              </w:rPr>
+            </w:pPr>
+            <w:r>
+              <w:rPr>
+                <w:rFonts w:eastAsiaTheme="minorEastAsia"/>
+              </w:rPr>
+              <w:t xml:space="preserve">Man </w:t>
+            </w:r>
+            <w:r>
+              <w:rPr>
+                <w:rFonts w:eastAsiaTheme="minorEastAsia"/>
+              </w:rPr>
+              <w:t>22</w:t>
+            </w:r>
+            <w:r>
+              <w:rPr>
+                <w:rFonts w:eastAsiaTheme="minorEastAsia"/>
+              </w:rPr>
+              <w:t>/6</w:t>
+            </w:r>
+          </w:p>
+          <w:p>
+            <w:pPr>
+              <w:jc w:val="center"/>
+              <w:rPr>
+                <w:rFonts w:eastAsiaTheme="minorEastAsia"/>
+              </w:rPr>
+            </w:pPr>
+            <w:r>
+              <w:rPr>
+                <w:rFonts w:eastAsiaTheme="minorEastAsia"/>
+              </w:rPr>
+              <w:t>4 timer</w:t>
+            </w:r>
+          </w:p>
+        </w:tc>
+        <w:tc>
+          <w:tcPr>
+            <w:tcW w:w="1375" w:type="dxa"/>
+          </w:tcPr>
+          <w:p>
+            <w:pPr>
+              <w:rPr>
+                <w:rFonts w:eastAsiaTheme="minorEastAsia"/>
+              </w:rPr>
+            </w:pPr>
+            <w:proofErr w:type="spellStart"/>
+            <w:r>
+              <w:rPr>
+                <w:rFonts w:eastAsiaTheme="minorEastAsia"/>
+              </w:rPr>
+              <w:t>Tirs</w:t>
+            </w:r>
+            <w:proofErr w:type="spellEnd"/>
+            <w:r>
+              <w:rPr>
+                <w:rFonts w:eastAsiaTheme="minorEastAsia"/>
+              </w:rPr>
+              <w:t xml:space="preserve"> </w:t>
+            </w:r>
+            <w:r>
+              <w:rPr>
+                <w:rFonts w:eastAsiaTheme="minorEastAsia"/>
+              </w:rPr>
+              <w:t>23</w:t>
+            </w:r>
+            <w:r>
+              <w:rPr>
+                <w:rFonts w:eastAsiaTheme="minorEastAsia"/>
+              </w:rPr>
+              <w:t>/6</w:t>
+            </w:r>
+          </w:p>
+          <w:p>
+            <w:pPr>
+              <w:jc w:val="center"/>
+              <w:rPr>
+                <w:rFonts w:eastAsiaTheme="minorEastAsia"/>
+              </w:rPr>
+            </w:pPr>
+            <w:r>
+              <w:rPr>
+                <w:rFonts w:eastAsiaTheme="minorEastAsia"/>
+              </w:rPr>
+              <w:t xml:space="preserve">4 timer </w:t>
+            </w:r>
+          </w:p>
+        </w:tc>
+        <w:tc>
+          <w:tcPr>
+            <w:tcW w:w="1375" w:type="dxa"/>
+          </w:tcPr>
+          <w:p>
+            <w:pPr>
+              <w:rPr>
+                <w:rFonts w:eastAsiaTheme="minorEastAsia"/>
+              </w:rPr>
+            </w:pPr>
+            <w:r>
+              <w:rPr>
+                <w:rFonts w:eastAsiaTheme="minorEastAsia"/>
+              </w:rPr>
+              <w:t xml:space="preserve">Ons </w:t>
+            </w:r>
+            <w:r>
+              <w:rPr>
+                <w:rFonts w:eastAsiaTheme="minorEastAsia"/>
+              </w:rPr>
+              <w:t>24</w:t>
+            </w:r>
+            <w:r>
+              <w:rPr>
+                <w:rFonts w:eastAsiaTheme="minorEastAsia"/>
+              </w:rPr>
+              <w:t>/6</w:t>
+            </w:r>
+          </w:p>
+          <w:p>
+            <w:pPr>
+              <w:jc w:val="center"/>
+              <w:rPr>
+                <w:rFonts w:eastAsiaTheme="minorEastAsia"/>
+              </w:rPr>
+            </w:pPr>
+            <w:r>
+              <w:rPr>
+                <w:rFonts w:eastAsiaTheme="minorEastAsia"/>
+              </w:rPr>
+              <w:t>4 timer</w:t>
+            </w:r>
+          </w:p>
+        </w:tc>
+        <w:tc>
+          <w:tcPr>
+            <w:tcW w:w="1375" w:type="dxa"/>
+          </w:tcPr>
+          <w:p>
+            <w:pPr>
+              <w:rPr>
+                <w:rFonts w:eastAsiaTheme="minorEastAsia"/>
+              </w:rPr>
+            </w:pPr>
+            <w:r>
+              <w:rPr>
+                <w:rFonts w:eastAsiaTheme="minorEastAsia"/>
+              </w:rPr>
+              <w:t xml:space="preserve">Tors </w:t>
+            </w:r>
+            <w:r>
+              <w:rPr>
+                <w:rFonts w:eastAsiaTheme="minorEastAsia"/>
+              </w:rPr>
+              <w:t>25</w:t>
+            </w:r>
+            <w:r>
+              <w:rPr>
+                <w:rFonts w:eastAsiaTheme="minorEastAsia"/>
+              </w:rPr>
+              <w:t xml:space="preserve">/6 </w:t>
+            </w:r>
+          </w:p>
+          <w:p>
+            <w:pPr>
+              <w:jc w:val="center"/>
+              <w:rPr>
+                <w:rFonts w:eastAsiaTheme="minorEastAsia"/>
+              </w:rPr>
+            </w:pPr>
+            <w:r>
+              <w:rPr>
+                <w:rFonts w:eastAsiaTheme="minorEastAsia"/>
+              </w:rPr>
+              <w:t>4 timer</w:t>
+            </w:r>
+          </w:p>
+        </w:tc>
+        <w:tc>
+          <w:tcPr>
+            <w:tcW w:w="1376" w:type="dxa"/>
+          </w:tcPr>
+          <w:p>
+            <w:pPr>
+              <w:rPr>
+                <w:rFonts w:eastAsiaTheme="minorEastAsia"/>
+              </w:rPr>
+            </w:pPr>
+            <w:proofErr w:type="spellStart"/>
+            <w:r>
+              <w:rPr>
+                <w:rFonts w:eastAsiaTheme="minorEastAsia"/>
+              </w:rPr>
+              <w:t>Fre</w:t>
+            </w:r>
+            <w:proofErr w:type="spellEnd"/>
+            <w:r>
+              <w:rPr>
+                <w:rFonts w:eastAsiaTheme="minorEastAsia"/>
+              </w:rPr>
+              <w:t xml:space="preserve"> </w:t>
+            </w:r>
+            <w:r>
+              <w:rPr>
+                <w:rFonts w:eastAsiaTheme="minorEastAsia"/>
+              </w:rPr>
+              <w:t>26</w:t>
+            </w:r>
+            <w:r>
+              <w:rPr>
+                <w:rFonts w:eastAsiaTheme="minorEastAsia"/>
+              </w:rPr>
+              <w:t>/6</w:t>
+            </w:r>
+            <w:r>
+              <w:rPr>
+                <w:rFonts w:eastAsiaTheme="minorEastAsia"/>
+              </w:rPr>
+              <w:t xml:space="preserve"> </w:t>
+            </w:r>
+          </w:p>
+          <w:p>
+            <w:pPr>
+              <w:jc w:val="center"/>
+              <w:rPr>
+                <w:rFonts w:eastAsiaTheme="minorEastAsia"/>
+              </w:rPr>
+            </w:pPr>
+          </w:p>
+        </w:tc>
+        <w:tc>
+          <w:tcPr>
+            <w:tcW w:w="1376" w:type="dxa"/>
+          </w:tcPr>
+          <w:p>
+            <w:pPr>
+              <w:rPr>
+                <w:rFonts w:eastAsiaTheme="minorEastAsia"/>
+              </w:rPr>
+            </w:pPr>
+            <w:proofErr w:type="spellStart"/>
+            <w:r>
+              <w:rPr>
+                <w:rFonts w:eastAsiaTheme="minorEastAsia"/>
+              </w:rPr>
+              <w:t>Lør</w:t>
+            </w:r>
+            <w:proofErr w:type="spellEnd"/>
+            <w:r>
+              <w:rPr>
+                <w:rFonts w:eastAsiaTheme="minorEastAsia"/>
+              </w:rPr>
+              <w:t xml:space="preserve"> </w:t>
+            </w:r>
+            <w:r>
+              <w:rPr>
+                <w:rFonts w:eastAsiaTheme="minorEastAsia"/>
+              </w:rPr>
+              <w:t>27</w:t>
+            </w:r>
+            <w:r>
+              <w:rPr>
+                <w:rFonts w:eastAsiaTheme="minorEastAsia"/>
+              </w:rPr>
+              <w:t>/6</w:t>
+            </w:r>
+          </w:p>
+          <w:p>
+            <w:pPr>
+              <w:jc w:val="center"/>
+              <w:rPr>
+                <w:rFonts w:eastAsiaTheme="minorEastAsia"/>
+              </w:rPr>
+            </w:pPr>
+            <w:r>
+              <w:rPr>
+                <w:rFonts w:eastAsiaTheme="minorEastAsia"/>
+              </w:rPr>
+              <w:t>4 timer</w:t>
+            </w:r>
+          </w:p>
+        </w:tc>
+        <w:tc>
+          <w:tcPr>
+            <w:tcW w:w="1376" w:type="dxa"/>
+          </w:tcPr>
+          <w:p>
+            <w:pPr>
+              <w:rPr>
+                <w:rFonts w:eastAsiaTheme="minorEastAsia"/>
+              </w:rPr>
+            </w:pPr>
+            <w:r>
+              <w:rPr>
+                <w:rFonts w:eastAsiaTheme="minorEastAsia"/>
+              </w:rPr>
+              <w:t>Søn 2</w:t>
+            </w:r>
+            <w:r>
+              <w:rPr>
+                <w:rFonts w:eastAsiaTheme="minorEastAsia"/>
+              </w:rPr>
+              <w:t>8</w:t>
+            </w:r>
+            <w:r>
+              <w:rPr>
+                <w:rFonts w:eastAsiaTheme="minorEastAsia"/>
+              </w:rPr>
+              <w:t>/6</w:t>
+            </w:r>
+          </w:p>
+          <w:p>
+            <w:pPr>
+              <w:jc w:val="center"/>
+              <w:rPr>
+                <w:rFonts w:eastAsiaTheme="minorEastAsia"/>
+              </w:rPr>
+            </w:pPr>
+            <w:r>
+              <w:rPr>
+                <w:rFonts w:eastAsiaTheme="minorEastAsia"/>
+              </w:rPr>
+              <w:t>4 timer</w:t>
+            </w:r>
+          </w:p>
+        </w:tc>
+      </w:tr>
+      <w:tr>
+        <w:tc>
+          <w:tcPr>
+            <w:tcW w:w="1375" w:type="dxa"/>
+          </w:tcPr>
+          <w:p>
+            <w:pPr>
+              <w:rPr>
+                <w:rFonts w:eastAsiaTheme="minorEastAsia"/>
+              </w:rPr>
+            </w:pPr>
+            <w:r>
+              <w:rPr>
+                <w:rFonts w:eastAsiaTheme="minorEastAsia"/>
+              </w:rPr>
+              <w:t xml:space="preserve">Man </w:t>
+            </w:r>
+            <w:r>
+              <w:rPr>
+                <w:rFonts w:eastAsiaTheme="minorEastAsia"/>
+              </w:rPr>
+              <w:t>29</w:t>
+            </w:r>
+            <w:r>
+              <w:rPr>
+                <w:rFonts w:eastAsiaTheme="minorEastAsia"/>
+              </w:rPr>
+              <w:t>/6</w:t>
+            </w:r>
+          </w:p>
+          <w:p>
+            <w:pPr>
+              <w:jc w:val="center"/>
+              <w:rPr>
+                <w:rFonts w:eastAsiaTheme="minorEastAsia"/>
+              </w:rPr>
+            </w:pPr>
+            <w:r>
+              <w:rPr>
+                <w:rFonts w:eastAsiaTheme="minorEastAsia"/>
+              </w:rPr>
+              <w:t>4 timer</w:t>
+            </w:r>
+          </w:p>
+        </w:tc>
+        <w:tc>
+          <w:tcPr>
+            <w:tcW w:w="1375" w:type="dxa"/>
+          </w:tcPr>
+          <w:p>
+            <w:pPr>
+              <w:rPr>
+                <w:rFonts w:eastAsiaTheme="minorEastAsia"/>
+              </w:rPr>
+            </w:pPr>
+            <w:proofErr w:type="spellStart"/>
+            <w:r>
+              <w:rPr>
+                <w:rFonts w:eastAsiaTheme="minorEastAsia"/>
+              </w:rPr>
+              <w:t>Tirs</w:t>
+            </w:r>
+            <w:proofErr w:type="spellEnd"/>
+            <w:r>
+              <w:rPr>
+                <w:rFonts w:eastAsiaTheme="minorEastAsia"/>
+              </w:rPr>
+              <w:t xml:space="preserve"> </w:t>
+            </w:r>
+            <w:r>
+              <w:rPr>
+                <w:rFonts w:eastAsiaTheme="minorEastAsia"/>
+              </w:rPr>
+              <w:t>30</w:t>
+            </w:r>
+            <w:r>
+              <w:rPr>
+                <w:rFonts w:eastAsiaTheme="minorEastAsia"/>
+              </w:rPr>
+              <w:t>/6</w:t>
+            </w:r>
+          </w:p>
+          <w:p>
+            <w:pPr>
+              <w:jc w:val="center"/>
+              <w:rPr>
+                <w:rFonts w:eastAsiaTheme="minorEastAsia"/>
+              </w:rPr>
+            </w:pPr>
+            <w:r>
+              <w:rPr>
+                <w:rFonts w:eastAsiaTheme="minorEastAsia"/>
+              </w:rPr>
+              <w:t>4 timer</w:t>
+            </w:r>
+          </w:p>
+        </w:tc>
+        <w:tc>
+          <w:tcPr>
+            <w:tcW w:w="1375" w:type="dxa"/>
+          </w:tcPr>
+          <w:p>
+            <w:pPr>
+              <w:rPr>
+                <w:rFonts w:eastAsiaTheme="minorEastAsia"/>
+              </w:rPr>
+            </w:pPr>
+            <w:r>
+              <w:rPr>
+                <w:rFonts w:eastAsiaTheme="minorEastAsia"/>
+              </w:rPr>
+              <w:t xml:space="preserve">Ons </w:t>
+            </w:r>
+            <w:r>
+              <w:rPr>
+                <w:rFonts w:eastAsiaTheme="minorEastAsia"/>
+              </w:rPr>
+              <w:t>31</w:t>
+            </w:r>
+            <w:r>
+              <w:rPr>
+                <w:rFonts w:eastAsiaTheme="minorEastAsia"/>
+              </w:rPr>
+              <w:t>/6</w:t>
+            </w:r>
+          </w:p>
+          <w:p>
+            <w:pPr>
+              <w:jc w:val="center"/>
+              <w:rPr>
+                <w:rFonts w:eastAsiaTheme="minorEastAsia"/>
+              </w:rPr>
+            </w:pPr>
+            <w:r>
+              <w:rPr>
+                <w:rFonts w:eastAsiaTheme="minorEastAsia"/>
+              </w:rPr>
+              <w:t>4 timer</w:t>
+            </w:r>
+          </w:p>
+        </w:tc>
+        <w:tc>
+          <w:tcPr>
+            <w:tcW w:w="1375" w:type="dxa"/>
+          </w:tcPr>
+          <w:p>
+            <w:pPr>
+              <w:rPr>
+                <w:rFonts w:eastAsiaTheme="minorEastAsia"/>
+              </w:rPr>
+            </w:pPr>
+          </w:p>
+        </w:tc>
+        <w:tc>
+          <w:tcPr>
+            <w:tcW w:w="1376" w:type="dxa"/>
+          </w:tcPr>
+          <w:p>
+            <w:pPr>
+              <w:rPr>
+                <w:rFonts w:eastAsiaTheme="minorEastAsia"/>
+              </w:rPr>
+            </w:pPr>
+          </w:p>
+        </w:tc>
+        <w:tc>
+          <w:tcPr>
+            <w:tcW w:w="1376" w:type="dxa"/>
+          </w:tcPr>
+          <w:p>
+            <w:pPr>
+              <w:rPr>
+                <w:rFonts w:eastAsiaTheme="minorEastAsia"/>
+              </w:rPr>
+            </w:pPr>
+          </w:p>
+        </w:tc>
+        <w:tc>
+          <w:tcPr>
+            <w:tcW w:w="1376" w:type="dxa"/>
+          </w:tcPr>
+          <w:p>
+            <w:pPr>
+              <w:rPr>
+                <w:rFonts w:eastAsiaTheme="minorEastAsia"/>
+              </w:rPr>
+            </w:pPr>
+          </w:p>
+        </w:tc>
+      </w:tr>
+    </w:tbl>
+    <w:p>
+      <w:pPr>
+        <w:rPr>
+          <w:rFonts w:eastAsiaTheme="minorEastAsia"/>
+        </w:rPr>
+      </w:pPr>
+      <w:r>
+        <w:rPr>
+          <w:rFonts w:eastAsiaTheme="minorEastAsia"/>
+        </w:rPr>
+        <w:t xml:space="preserve">I min fordeling har jeg været optimistisk. Jeg har taget højde for, at vi måske skal ud at fejre det torsdag d. 25 og ikke andre dage derefter. Men de andre bliver færdige den 25, så det er kun mig der har arbejde derefter. </w:t>
+      </w:r>
+    </w:p>
+    <w:p>
+      <w:pPr>
+        <w:rPr>
+          <w:rFonts w:eastAsiaTheme="minorEastAsia"/>
+        </w:rPr>
+      </w:pPr>
+      <w:r>
+        <w:rPr>
+          <w:rFonts w:eastAsiaTheme="minorEastAsia"/>
+        </w:rPr>
+        <w:t>Så allerhelst vil jeg være færdig den 25. Med en deadline den 31, så har jeg planlagt 8 - 13 dages arbejde, eller 32 - 52 timer.</w:t>
+      </w:r>
+    </w:p>
+    <w:p>
+      <w:pPr>
+        <w:rPr>
+          <w:rFonts w:eastAsiaTheme="minorEastAsia"/>
+        </w:rPr>
+      </w:pPr>
     </w:p>
     <w:sectPr>
       <w:pgSz w:w="11906" w:h="16838"/>
@@ -1798,6 +2775,126 @@
     </w:sectPr>
   </w:body>
 </w:document>
+</file>
+
+<file path=word/numbering.xml><?xml version="1.0" encoding="utf-8"?>
+<w:numbering xmlns:wpc="http://schemas.microsoft.com/office/word/2010/wordprocessingCanvas" xmlns:cx="http://schemas.microsoft.com/office/drawing/2014/chartex" xmlns:cx1="http://schemas.microsoft.com/office/drawing/2015/9/8/chartex" xmlns:cx2="http://schemas.microsoft.com/office/drawing/2015/10/21/chartex" xmlns:cx3="http://schemas.microsoft.com/office/drawing/2016/5/9/chartex" xmlns:cx4="http://schemas.microsoft.com/office/drawing/2016/5/10/chartex" xmlns:cx5="http://schemas.microsoft.com/office/drawing/2016/5/11/chartex" xmlns:cx6="http://schemas.microsoft.com/office/drawing/2016/5/12/chartex" xmlns:cx7="http://schemas.microsoft.com/office/drawing/2016/5/13/chartex" xmlns:cx8="http://schemas.microsoft.com/office/drawing/2016/5/14/chartex" xmlns:mc="http://schemas.openxmlformats.org/markup-compatibility/2006" xmlns:aink="http://schemas.microsoft.com/office/drawing/2016/ink" xmlns:am3d="http://schemas.microsoft.com/office/drawing/2017/model3d" xmlns:o="urn:schemas-microsoft-com:office:office" xmlns:oel="http://schemas.microsoft.com/office/2019/extlst" xmlns:r="http://schemas.openxmlformats.org/officeDocument/2006/relationships" xmlns:m="http://schemas.openxmlformats.org/officeDocument/2006/math" xmlns:v="urn:schemas-microsoft-com:vml" xmlns:wp14="http://schemas.microsoft.com/office/word/2010/wordprocessingDrawing" xmlns:wp="http://schemas.openxmlformats.org/drawingml/2006/wordprocessingDrawing" xmlns:w10="urn:schemas-microsoft-com:office:word" xmlns:w="http://schemas.openxmlformats.org/wordprocessingml/2006/main" xmlns:w14="http://schemas.microsoft.com/office/word/2010/wordml" xmlns:w15="http://schemas.microsoft.com/office/word/2012/wordml" xmlns:w16cex="http://schemas.microsoft.com/office/word/2018/wordml/cex" xmlns:w16cid="http://schemas.microsoft.com/office/word/2016/wordml/cid" xmlns:w16="http://schemas.microsoft.com/office/word/2018/wordml" xmlns:w16du="http://schemas.microsoft.com/office/word/2023/wordml/word16du" xmlns:w16sdtdh="http://schemas.microsoft.com/office/word/2020/wordml/sdtdatahash" xmlns:w16se="http://schemas.microsoft.com/office/word/2015/wordml/symex" xmlns:wpg="http://schemas.microsoft.com/office/word/2010/wordprocessingGroup" xmlns:wpi="http://schemas.microsoft.com/office/word/2010/wordprocessingInk" xmlns:wne="http://schemas.microsoft.com/office/word/2006/wordml" xmlns:wps="http://schemas.microsoft.com/office/word/2010/wordprocessingShape" mc:Ignorable="w14 w15 w16se w16cid w16 w16cex w16sdtdh w16du wp14">
+  <w:abstractNum w:abstractNumId="0" w15:restartNumberingAfterBreak="0">
+    <w:nsid w:val="5AD44823"/>
+    <w:multiLevelType w:val="hybridMultilevel"/>
+    <w:tmpl w:val="6EEE0192"/>
+    <w:lvl w:ilvl="0" w:tplc="6CD6B4B0">
+      <w:numFmt w:val="bullet"/>
+      <w:lvlText w:val="-"/>
+      <w:lvlJc w:val="left"/>
+      <w:pPr>
+        <w:ind w:left="720" w:hanging="360"/>
+      </w:pPr>
+      <w:rPr>
+        <w:rFonts w:ascii="Calibri" w:eastAsiaTheme="minorEastAsia" w:hAnsi="Calibri" w:cs="Calibri" w:hint="default"/>
+      </w:rPr>
+    </w:lvl>
+    <w:lvl w:ilvl="1" w:tplc="04060003" w:tentative="1">
+      <w:start w:val="1"/>
+      <w:numFmt w:val="bullet"/>
+      <w:lvlText w:val="o"/>
+      <w:lvlJc w:val="left"/>
+      <w:pPr>
+        <w:ind w:left="1440" w:hanging="360"/>
+      </w:pPr>
+      <w:rPr>
+        <w:rFonts w:ascii="Courier New" w:hAnsi="Courier New" w:cs="Courier New" w:hint="default"/>
+      </w:rPr>
+    </w:lvl>
+    <w:lvl w:ilvl="2" w:tplc="04060005" w:tentative="1">
+      <w:start w:val="1"/>
+      <w:numFmt w:val="bullet"/>
+      <w:lvlText w:val=""/>
+      <w:lvlJc w:val="left"/>
+      <w:pPr>
+        <w:ind w:left="2160" w:hanging="360"/>
+      </w:pPr>
+      <w:rPr>
+        <w:rFonts w:ascii="Wingdings" w:hAnsi="Wingdings" w:hint="default"/>
+      </w:rPr>
+    </w:lvl>
+    <w:lvl w:ilvl="3" w:tplc="04060001" w:tentative="1">
+      <w:start w:val="1"/>
+      <w:numFmt w:val="bullet"/>
+      <w:lvlText w:val=""/>
+      <w:lvlJc w:val="left"/>
+      <w:pPr>
+        <w:ind w:left="2880" w:hanging="360"/>
+      </w:pPr>
+      <w:rPr>
+        <w:rFonts w:ascii="Symbol" w:hAnsi="Symbol" w:hint="default"/>
+      </w:rPr>
+    </w:lvl>
+    <w:lvl w:ilvl="4" w:tplc="04060003" w:tentative="1">
+      <w:start w:val="1"/>
+      <w:numFmt w:val="bullet"/>
+      <w:lvlText w:val="o"/>
+      <w:lvlJc w:val="left"/>
+      <w:pPr>
+        <w:ind w:left="3600" w:hanging="360"/>
+      </w:pPr>
+      <w:rPr>
+        <w:rFonts w:ascii="Courier New" w:hAnsi="Courier New" w:cs="Courier New" w:hint="default"/>
+      </w:rPr>
+    </w:lvl>
+    <w:lvl w:ilvl="5" w:tplc="04060005" w:tentative="1">
+      <w:start w:val="1"/>
+      <w:numFmt w:val="bullet"/>
+      <w:lvlText w:val=""/>
+      <w:lvlJc w:val="left"/>
+      <w:pPr>
+        <w:ind w:left="4320" w:hanging="360"/>
+      </w:pPr>
+      <w:rPr>
+        <w:rFonts w:ascii="Wingdings" w:hAnsi="Wingdings" w:hint="default"/>
+      </w:rPr>
+    </w:lvl>
+    <w:lvl w:ilvl="6" w:tplc="04060001" w:tentative="1">
+      <w:start w:val="1"/>
+      <w:numFmt w:val="bullet"/>
+      <w:lvlText w:val=""/>
+      <w:lvlJc w:val="left"/>
+      <w:pPr>
+        <w:ind w:left="5040" w:hanging="360"/>
+      </w:pPr>
+      <w:rPr>
+        <w:rFonts w:ascii="Symbol" w:hAnsi="Symbol" w:hint="default"/>
+      </w:rPr>
+    </w:lvl>
+    <w:lvl w:ilvl="7" w:tplc="04060003" w:tentative="1">
+      <w:start w:val="1"/>
+      <w:numFmt w:val="bullet"/>
+      <w:lvlText w:val="o"/>
+      <w:lvlJc w:val="left"/>
+      <w:pPr>
+        <w:ind w:left="5760" w:hanging="360"/>
+      </w:pPr>
+      <w:rPr>
+        <w:rFonts w:ascii="Courier New" w:hAnsi="Courier New" w:cs="Courier New" w:hint="default"/>
+      </w:rPr>
+    </w:lvl>
+    <w:lvl w:ilvl="8" w:tplc="04060005" w:tentative="1">
+      <w:start w:val="1"/>
+      <w:numFmt w:val="bullet"/>
+      <w:lvlText w:val=""/>
+      <w:lvlJc w:val="left"/>
+      <w:pPr>
+        <w:ind w:left="6480" w:hanging="360"/>
+      </w:pPr>
+      <w:rPr>
+        <w:rFonts w:ascii="Wingdings" w:hAnsi="Wingdings" w:hint="default"/>
+      </w:rPr>
+    </w:lvl>
+  </w:abstractNum>
+  <w:num w:numId="1" w16cid:durableId="1401514622">
+    <w:abstractNumId w:val="0"/>
+  </w:num>
+</w:numbering>
 </file>
 
 <file path=word/styles.xml><?xml version="1.0" encoding="utf-8"?>

</xml_diff>